<commit_message>
pig scripts and report updated
</commit_message>
<xml_diff>
--- a/docs/Flight_Data_Analysis_Report_Updated.docx
+++ b/docs/Flight_Data_Analysis_Report_Updated.docx
@@ -7817,7 +7817,7 @@
                 <w:sz w:val="14"/>
               </w:rPr>
               <w:br/>
-              <w:t xml:space="preserve">STORE ordered INTO 'E:/BDAL/Report_1/Flight_Data_Analysis/outputs/pig/01_airline_flight_totals' USING </w:t>
+              <w:t xml:space="preserve">STORE ordered INTO 'E:/BDAL/Final_Assignment/Flight_Data_Analysis/PigAnalysis/output/01_airline_flight_totals' USING </w:t>
             </w:r>
             <w:proofErr w:type="spellStart"/>
             <w:proofErr w:type="gramStart"/>
@@ -8225,7 +8225,7 @@
                 <w:sz w:val="14"/>
               </w:rPr>
               <w:br/>
-              <w:t xml:space="preserve">STORE ordered INTO 'E:/BDAL/Report_1/Flight_Data_Analysis/outputs/pig/02_monthly_flight_totals' USING </w:t>
+              <w:t xml:space="preserve">STORE ordered INTO 'E:/BDAL/Final_Assignment/Flight_Data_Analysis/PigAnalysis/output/02_monthly_flight_totals' USING </w:t>
             </w:r>
             <w:proofErr w:type="spellStart"/>
             <w:proofErr w:type="gramStart"/>
@@ -8633,7 +8633,7 @@
                 <w:sz w:val="14"/>
               </w:rPr>
               <w:br/>
-              <w:t xml:space="preserve">STORE result INTO 'E:/BDAL/Report_1/Flight_Data_Analysis/outputs/pig/03_top_origin_airports' USING </w:t>
+              <w:t xml:space="preserve">STORE result INTO 'E:/BDAL/Final_Assignment/Flight_Data_Analysis/PigAnalysis/output/03_top_origin_airports' USING </w:t>
             </w:r>
             <w:proofErr w:type="spellStart"/>
             <w:proofErr w:type="gramStart"/>
@@ -9057,7 +9057,7 @@
                 <w:sz w:val="14"/>
               </w:rPr>
               <w:br/>
-              <w:t xml:space="preserve">STORE result INTO 'E:/BDAL/Report_1/Flight_Data_Analysis/outputs/pig/04_top_routes' USING </w:t>
+              <w:t xml:space="preserve">STORE result INTO 'E:/BDAL/Final_Assignment/Flight_Data_Analysis/PigAnalysis/output/04_top_routes' USING </w:t>
             </w:r>
             <w:proofErr w:type="spellStart"/>
             <w:proofErr w:type="gramStart"/>
@@ -9480,7 +9480,7 @@
                 <w:sz w:val="14"/>
               </w:rPr>
               <w:br/>
-              <w:t xml:space="preserve">STORE ordered INTO 'E:/BDAL/Report_1/Flight_Data_Analysis/outputs/pig/05_average_departure_delay_by_airline' USING </w:t>
+              <w:t xml:space="preserve">STORE ordered INTO 'E:/BDAL/Final_Assignment/Flight_Data_Analysis/PigAnalysis/output/05_average_departure_delay_by_airline' USING </w:t>
             </w:r>
             <w:proofErr w:type="spellStart"/>
             <w:proofErr w:type="gramStart"/>
@@ -9904,7 +9904,7 @@
                 <w:sz w:val="14"/>
               </w:rPr>
               <w:br/>
-              <w:t xml:space="preserve">STORE ordered INTO 'E:/BDAL/Report_1/Flight_Data_Analysis/outputs/pig/06_cancellations_by_airline' USING </w:t>
+              <w:t xml:space="preserve">STORE ordered INTO 'E:/BDAL/Final_Assignment/Flight_Data_Analysis/PigAnalysis/output/06_cancellations_by_airline' USING </w:t>
             </w:r>
             <w:proofErr w:type="gramStart"/>
             <w:r>
@@ -10321,7 +10321,7 @@
                 <w:sz w:val="14"/>
               </w:rPr>
               <w:br/>
-              <w:t xml:space="preserve">STORE ordered INTO 'E:/BDAL/Report_1/Flight_Data_Analysis/outputs/pig/07_average_arrival_delay_by_month' USING </w:t>
+              <w:t xml:space="preserve">STORE ordered INTO 'E:/BDAL/Final_Assignment/Flight_Data_Analysis/PigAnalysis/output/07_average_arrival_delay_by_month' USING </w:t>
             </w:r>
             <w:proofErr w:type="spellStart"/>
             <w:proofErr w:type="gramStart"/>

</xml_diff>

<commit_message>
Dataset path update in pig scripts
</commit_message>
<xml_diff>
--- a/docs/Flight_Data_Analysis_Report_Updated.docx
+++ b/docs/Flight_Data_Analysis_Report_Updated.docx
@@ -1399,15 +1399,7 @@
           <w:rFonts w:cs="Times New Roman"/>
           <w:color w:val="000000" w:themeColor="text1"/>
         </w:rPr>
-        <w:t xml:space="preserve">Analyze the supplied 2015 U.S. flight dataset using Hadoop MapReduce and Apache Pig. The analysis identifies flight volumes, airport activity, monthly demand, cancellation patterns, and delay performance using the fields available in the </w:t>
-      </w:r>
-      <w:proofErr w:type="gramStart"/>
-      <w:r>
-        <w:rPr>
-          <w:rFonts w:cs="Times New Roman"/>
-          <w:color w:val="000000" w:themeColor="text1"/>
-        </w:rPr>
-        <w:t>dataset.</w:t>
+        <w:t>Analyze the supplied 2015 U.S. flight dataset using Hadoop MapReduce and Apache Pig. The analysis identifies flight volumes, airport activity, monthly demand, cancellation patterns, and delay performance using the fields available in the dataset.</w:t>
       </w:r>
       <w:r>
         <w:rPr>
@@ -1415,7 +1407,6 @@
         </w:rPr>
         <w:t>.</w:t>
       </w:r>
-      <w:proofErr w:type="gramEnd"/>
       <w:r>
         <w:rPr>
           <w:color w:val="000000" w:themeColor="text1"/>
@@ -3204,25 +3195,7 @@
                 <w:sz w:val="14"/>
               </w:rPr>
               <w:br/>
-              <w:t xml:space="preserve">    System.exit(job.waitForCompletion(true) ? </w:t>
-            </w:r>
-            <w:proofErr w:type="gramStart"/>
-            <w:r>
-              <w:rPr>
-                <w:rFonts w:cs="Times New Roman"/>
-                <w:color w:val="000000" w:themeColor="text1"/>
-                <w:sz w:val="14"/>
-              </w:rPr>
-              <w:t>0 :</w:t>
-            </w:r>
-            <w:proofErr w:type="gramEnd"/>
-            <w:r>
-              <w:rPr>
-                <w:rFonts w:cs="Times New Roman"/>
-                <w:color w:val="000000" w:themeColor="text1"/>
-                <w:sz w:val="14"/>
-              </w:rPr>
-              <w:t xml:space="preserve"> 1);</w:t>
+              <w:t xml:space="preserve">    System.exit(job.waitForCompletion(true) ? 0 : 1);</w:t>
             </w:r>
             <w:r>
               <w:rPr>
@@ -4248,25 +4221,7 @@
                 <w:sz w:val="14"/>
               </w:rPr>
               <w:br/>
-              <w:t xml:space="preserve">    public void </w:t>
-            </w:r>
-            <w:proofErr w:type="gramStart"/>
-            <w:r>
-              <w:rPr>
-                <w:rFonts w:cs="Times New Roman"/>
-                <w:color w:val="000000" w:themeColor="text1"/>
-                <w:sz w:val="14"/>
-              </w:rPr>
-              <w:t>reduce(</w:t>
-            </w:r>
-            <w:proofErr w:type="gramEnd"/>
-            <w:r>
-              <w:rPr>
-                <w:rFonts w:cs="Times New Roman"/>
-                <w:color w:val="000000" w:themeColor="text1"/>
-                <w:sz w:val="14"/>
-              </w:rPr>
-              <w:t>Text key, Iterable&lt;IntWritable&gt; values, Context context) throws IOException, InterruptedException {</w:t>
+              <w:t xml:space="preserve">    public void reduce(Text key, Iterable&lt;IntWritable&gt; values, Context context) throws IOException, InterruptedException {</w:t>
             </w:r>
             <w:r>
               <w:rPr>
@@ -4374,25 +4329,7 @@
                 <w:sz w:val="14"/>
               </w:rPr>
               <w:br/>
-              <w:t xml:space="preserve">    System.exit(job.waitForCompletion(true) ? </w:t>
-            </w:r>
-            <w:proofErr w:type="gramStart"/>
-            <w:r>
-              <w:rPr>
-                <w:rFonts w:cs="Times New Roman"/>
-                <w:color w:val="000000" w:themeColor="text1"/>
-                <w:sz w:val="14"/>
-              </w:rPr>
-              <w:t>0 :</w:t>
-            </w:r>
-            <w:proofErr w:type="gramEnd"/>
-            <w:r>
-              <w:rPr>
-                <w:rFonts w:cs="Times New Roman"/>
-                <w:color w:val="000000" w:themeColor="text1"/>
-                <w:sz w:val="14"/>
-              </w:rPr>
-              <w:t xml:space="preserve"> 1);</w:t>
+              <w:t xml:space="preserve">    System.exit(job.waitForCompletion(true) ? 0 : 1);</w:t>
             </w:r>
             <w:r>
               <w:rPr>
@@ -5495,25 +5432,7 @@
                 <w:sz w:val="14"/>
               </w:rPr>
               <w:br/>
-              <w:t xml:space="preserve">    System.exit(job.waitForCompletion(true) ? </w:t>
-            </w:r>
-            <w:proofErr w:type="gramStart"/>
-            <w:r>
-              <w:rPr>
-                <w:rFonts w:cs="Times New Roman"/>
-                <w:color w:val="000000" w:themeColor="text1"/>
-                <w:sz w:val="14"/>
-              </w:rPr>
-              <w:t>0 :</w:t>
-            </w:r>
-            <w:proofErr w:type="gramEnd"/>
-            <w:r>
-              <w:rPr>
-                <w:rFonts w:cs="Times New Roman"/>
-                <w:color w:val="000000" w:themeColor="text1"/>
-                <w:sz w:val="14"/>
-              </w:rPr>
-              <w:t xml:space="preserve"> 1);</w:t>
+              <w:t xml:space="preserve">    System.exit(job.waitForCompletion(true) ? 0 : 1);</w:t>
             </w:r>
             <w:r>
               <w:rPr>
@@ -5609,43 +5528,13 @@
                 <w:color w:val="000000" w:themeColor="text1"/>
               </w:rPr>
             </w:pPr>
-            <w:proofErr w:type="spellStart"/>
             <w:r>
               <w:rPr>
                 <w:rFonts w:cs="Times New Roman"/>
                 <w:color w:val="000000" w:themeColor="text1"/>
                 <w:sz w:val="16"/>
               </w:rPr>
-              <w:t>hadoop</w:t>
-            </w:r>
-            <w:proofErr w:type="spellEnd"/>
-            <w:r>
-              <w:rPr>
-                <w:rFonts w:cs="Times New Roman"/>
-                <w:color w:val="000000" w:themeColor="text1"/>
-                <w:sz w:val="16"/>
-              </w:rPr>
-              <w:t xml:space="preserve"> jar MapReduce\build\flightanalysis.jar </w:t>
-            </w:r>
-            <w:proofErr w:type="spellStart"/>
-            <w:proofErr w:type="gramStart"/>
-            <w:r>
-              <w:rPr>
-                <w:rFonts w:cs="Times New Roman"/>
-                <w:color w:val="000000" w:themeColor="text1"/>
-                <w:sz w:val="16"/>
-              </w:rPr>
-              <w:t>flightanalysis.MonthlyFlightCount</w:t>
-            </w:r>
-            <w:proofErr w:type="spellEnd"/>
-            <w:proofErr w:type="gramEnd"/>
-            <w:r>
-              <w:rPr>
-                <w:rFonts w:cs="Times New Roman"/>
-                <w:color w:val="000000" w:themeColor="text1"/>
-                <w:sz w:val="16"/>
-              </w:rPr>
-              <w:t xml:space="preserve"> data\flights.csv MapReduce\output\03_monthly_flight_count</w:t>
+              <w:t>hadoop jar MapReduce\build\flightanalysis.jar flightanalysis.MonthlyFlightCount data\flights.csv MapReduce\output\03_monthly_flight_count</w:t>
             </w:r>
           </w:p>
         </w:tc>
@@ -6656,25 +6545,7 @@
                 <w:sz w:val="14"/>
               </w:rPr>
               <w:br/>
-              <w:t xml:space="preserve">    System.exit(job.waitForCompletion(true) ? </w:t>
-            </w:r>
-            <w:proofErr w:type="gramStart"/>
-            <w:r>
-              <w:rPr>
-                <w:rFonts w:cs="Times New Roman"/>
-                <w:color w:val="000000" w:themeColor="text1"/>
-                <w:sz w:val="14"/>
-              </w:rPr>
-              <w:t>0 :</w:t>
-            </w:r>
-            <w:proofErr w:type="gramEnd"/>
-            <w:r>
-              <w:rPr>
-                <w:rFonts w:cs="Times New Roman"/>
-                <w:color w:val="000000" w:themeColor="text1"/>
-                <w:sz w:val="14"/>
-              </w:rPr>
-              <w:t xml:space="preserve"> 1);</w:t>
+              <w:t xml:space="preserve">    System.exit(job.waitForCompletion(true) ? 0 : 1);</w:t>
             </w:r>
             <w:r>
               <w:rPr>
@@ -7795,25 +7666,7 @@
                 <w:sz w:val="14"/>
               </w:rPr>
               <w:br/>
-              <w:t xml:space="preserve">    System.exit(job.waitForCompletion(true) ? </w:t>
-            </w:r>
-            <w:proofErr w:type="gramStart"/>
-            <w:r>
-              <w:rPr>
-                <w:rFonts w:cs="Times New Roman"/>
-                <w:color w:val="000000" w:themeColor="text1"/>
-                <w:sz w:val="14"/>
-              </w:rPr>
-              <w:t>0 :</w:t>
-            </w:r>
-            <w:proofErr w:type="gramEnd"/>
-            <w:r>
-              <w:rPr>
-                <w:rFonts w:cs="Times New Roman"/>
-                <w:color w:val="000000" w:themeColor="text1"/>
-                <w:sz w:val="14"/>
-              </w:rPr>
-              <w:t xml:space="preserve"> 1);</w:t>
+              <w:t xml:space="preserve">    System.exit(job.waitForCompletion(true) ? 0 : 1);</w:t>
             </w:r>
             <w:r>
               <w:rPr>
@@ -8638,43 +8491,23 @@
                 <w:color w:val="000000" w:themeColor="text1"/>
                 <w:sz w:val="14"/>
               </w:rPr>
-              <w:t>flights = LOAD 'E:/BDAL/</w:t>
-            </w:r>
-            <w:proofErr w:type="spellStart"/>
-            <w:r>
-              <w:rPr>
-                <w:rFonts w:cs="Times New Roman"/>
-                <w:color w:val="000000" w:themeColor="text1"/>
-                <w:sz w:val="14"/>
-              </w:rPr>
-              <w:t>New_Dataset</w:t>
-            </w:r>
-            <w:proofErr w:type="spellEnd"/>
-            <w:r>
-              <w:rPr>
-                <w:rFonts w:cs="Times New Roman"/>
-                <w:color w:val="000000" w:themeColor="text1"/>
-                <w:sz w:val="14"/>
-              </w:rPr>
-              <w:t xml:space="preserve">/flights.csv' USING </w:t>
-            </w:r>
-            <w:proofErr w:type="spellStart"/>
-            <w:r>
-              <w:rPr>
-                <w:rFonts w:cs="Times New Roman"/>
-                <w:color w:val="000000" w:themeColor="text1"/>
-                <w:sz w:val="14"/>
-              </w:rPr>
-              <w:t>PigStorage</w:t>
-            </w:r>
-            <w:proofErr w:type="spellEnd"/>
-            <w:r>
-              <w:rPr>
-                <w:rFonts w:cs="Times New Roman"/>
-                <w:color w:val="000000" w:themeColor="text1"/>
-                <w:sz w:val="14"/>
-              </w:rPr>
-              <w:t>(',') AS (year:int,month:int,day:int,day_of_week:int,airline:chararray,flight_number:int,tail_number:chararray,origin:chararray,destination:chararray,scheduled_departure:chararray,departure_time:chararray,departure_delay:double,taxi_out:double,wheels_off:chararray,scheduled_time:double,elapsed_time:double,air_time:double,distance:double,wheels_on:chararray,taxi_in:double,scheduled_arrival:chararray,arrival_time:chararray,arrival_delay:double,diverted:int,cancelled:int,cancellation_reason:chararray,air_system_delay:double,security_delay:double,airline_delay:double,late_aircraft_delay:double,weather_delay:double);</w:t>
+              <w:t>flights = LOAD '</w:t>
+            </w:r>
+            <w:r>
+              <w:rPr>
+                <w:rFonts w:cs="Times New Roman"/>
+                <w:color w:val="000000" w:themeColor="text1"/>
+                <w:sz w:val="14"/>
+              </w:rPr>
+              <w:t>E:\BDAL\Final_Assignment\Flight_Data_Analysis\data\flights.csv</w:t>
+            </w:r>
+            <w:r>
+              <w:rPr>
+                <w:rFonts w:cs="Times New Roman"/>
+                <w:color w:val="000000" w:themeColor="text1"/>
+                <w:sz w:val="14"/>
+              </w:rPr>
+              <w:t>' USING PigStorage(',') AS (year:int,month:int,day:int,day_of_week:int,airline:chararray,flight_number:int,tail_number:chararray,origin:chararray,destination:chararray,scheduled_departure:chararray,departure_time:chararray,departure_delay:double,taxi_out:double,wheels_off:chararray,scheduled_time:double,elapsed_time:double,air_time:double,distance:double,wheels_on:chararray,taxi_in:double,scheduled_arrival:chararray,arrival_time:chararray,arrival_delay:double,diverted:int,cancelled:int,cancellation_reason:chararray,air_system_delay:double,security_delay:double,airline_delay:double,late_aircraft_delay:double,weather_delay:double);</w:t>
             </w:r>
           </w:p>
           <w:p>
@@ -8692,97 +8525,32 @@
                 <w:sz w:val="14"/>
               </w:rPr>
               <w:br/>
-              <w:t>airlines = LOAD 'E:/BDAL/</w:t>
-            </w:r>
-            <w:proofErr w:type="spellStart"/>
-            <w:r>
-              <w:rPr>
-                <w:rFonts w:cs="Times New Roman"/>
-                <w:color w:val="000000" w:themeColor="text1"/>
-                <w:sz w:val="14"/>
-              </w:rPr>
-              <w:t>New_Dataset</w:t>
-            </w:r>
-            <w:proofErr w:type="spellEnd"/>
-            <w:r>
-              <w:rPr>
-                <w:rFonts w:cs="Times New Roman"/>
-                <w:color w:val="000000" w:themeColor="text1"/>
-                <w:sz w:val="14"/>
-              </w:rPr>
-              <w:t xml:space="preserve">/airlines.csv' USING </w:t>
-            </w:r>
-            <w:proofErr w:type="spellStart"/>
-            <w:proofErr w:type="gramStart"/>
-            <w:r>
-              <w:rPr>
-                <w:rFonts w:cs="Times New Roman"/>
-                <w:color w:val="000000" w:themeColor="text1"/>
-                <w:sz w:val="14"/>
-              </w:rPr>
-              <w:t>PigStorage</w:t>
-            </w:r>
-            <w:proofErr w:type="spellEnd"/>
-            <w:r>
-              <w:rPr>
-                <w:rFonts w:cs="Times New Roman"/>
-                <w:color w:val="000000" w:themeColor="text1"/>
-                <w:sz w:val="14"/>
-              </w:rPr>
-              <w:t>(</w:t>
-            </w:r>
-            <w:proofErr w:type="gramEnd"/>
-            <w:r>
-              <w:rPr>
-                <w:rFonts w:cs="Times New Roman"/>
-                <w:color w:val="000000" w:themeColor="text1"/>
-                <w:sz w:val="14"/>
-              </w:rPr>
-              <w:t>',') AS (</w:t>
-            </w:r>
-            <w:proofErr w:type="spellStart"/>
-            <w:r>
-              <w:rPr>
-                <w:rFonts w:cs="Times New Roman"/>
-                <w:color w:val="000000" w:themeColor="text1"/>
-                <w:sz w:val="14"/>
-              </w:rPr>
-              <w:t>code:chararray,airline_name:chararray</w:t>
-            </w:r>
-            <w:proofErr w:type="spellEnd"/>
-            <w:r>
-              <w:rPr>
-                <w:rFonts w:cs="Times New Roman"/>
-                <w:color w:val="000000" w:themeColor="text1"/>
-                <w:sz w:val="14"/>
-              </w:rPr>
-              <w:t>);</w:t>
-            </w:r>
-            <w:r>
-              <w:rPr>
-                <w:rFonts w:cs="Times New Roman"/>
-                <w:color w:val="000000" w:themeColor="text1"/>
-                <w:sz w:val="14"/>
-              </w:rPr>
-              <w:br/>
-            </w:r>
-            <w:proofErr w:type="spellStart"/>
-            <w:r>
-              <w:rPr>
-                <w:rFonts w:cs="Times New Roman"/>
-                <w:color w:val="000000" w:themeColor="text1"/>
-                <w:sz w:val="14"/>
-              </w:rPr>
-              <w:t>valid_flights</w:t>
-            </w:r>
-            <w:proofErr w:type="spellEnd"/>
-            <w:r>
-              <w:rPr>
-                <w:rFonts w:cs="Times New Roman"/>
-                <w:color w:val="000000" w:themeColor="text1"/>
-                <w:sz w:val="14"/>
-              </w:rPr>
-              <w:t xml:space="preserve"> = FILTER flights BY year IS NOT NULL;</w:t>
+              <w:t>airlines = LOAD '</w:t>
+            </w:r>
+            <w:r>
+              <w:rPr>
+                <w:rFonts w:cs="Times New Roman"/>
+                <w:color w:val="000000" w:themeColor="text1"/>
+                <w:sz w:val="14"/>
+              </w:rPr>
+              <w:t>E:\BDAL\Final_Assignment\Flight_Data_Analysis\data\</w:t>
+            </w:r>
+            <w:r>
+              <w:rPr>
+                <w:rFonts w:cs="Times New Roman"/>
+                <w:color w:val="000000" w:themeColor="text1"/>
+                <w:sz w:val="14"/>
+              </w:rPr>
+              <w:t>airlines.csv' USING PigStorage(',') AS (code:chararray,airline_name:chararray);</w:t>
+            </w:r>
+            <w:r>
+              <w:rPr>
+                <w:rFonts w:cs="Times New Roman"/>
+                <w:color w:val="000000" w:themeColor="text1"/>
+                <w:sz w:val="14"/>
+              </w:rPr>
+              <w:br/>
+              <w:t>valid_flights = FILTER flights BY year IS NOT NULL;</w:t>
             </w:r>
             <w:r>
               <w:rPr>
@@ -8818,43 +8586,7 @@
                 <w:sz w:val="14"/>
               </w:rPr>
               <w:br/>
-              <w:t xml:space="preserve">named = JOIN totals BY </w:t>
-            </w:r>
-            <w:proofErr w:type="spellStart"/>
-            <w:r>
-              <w:rPr>
-                <w:rFonts w:cs="Times New Roman"/>
-                <w:color w:val="000000" w:themeColor="text1"/>
-                <w:sz w:val="14"/>
-              </w:rPr>
-              <w:t>airline_code</w:t>
-            </w:r>
-            <w:proofErr w:type="spellEnd"/>
-            <w:r>
-              <w:rPr>
-                <w:rFonts w:cs="Times New Roman"/>
-                <w:color w:val="000000" w:themeColor="text1"/>
-                <w:sz w:val="14"/>
-              </w:rPr>
-              <w:t xml:space="preserve">, </w:t>
-            </w:r>
-            <w:proofErr w:type="spellStart"/>
-            <w:r>
-              <w:rPr>
-                <w:rFonts w:cs="Times New Roman"/>
-                <w:color w:val="000000" w:themeColor="text1"/>
-                <w:sz w:val="14"/>
-              </w:rPr>
-              <w:t>valid_airlines</w:t>
-            </w:r>
-            <w:proofErr w:type="spellEnd"/>
-            <w:r>
-              <w:rPr>
-                <w:rFonts w:cs="Times New Roman"/>
-                <w:color w:val="000000" w:themeColor="text1"/>
-                <w:sz w:val="14"/>
-              </w:rPr>
-              <w:t xml:space="preserve"> BY code;</w:t>
+              <w:t>named = JOIN totals BY airline_code, valid_airlines BY code;</w:t>
             </w:r>
           </w:p>
           <w:p>
@@ -8872,52 +8604,16 @@
                 <w:sz w:val="14"/>
               </w:rPr>
               <w:br/>
-              <w:t xml:space="preserve">result = FOREACH named GENERATE </w:t>
-            </w:r>
-            <w:proofErr w:type="gramStart"/>
-            <w:r>
-              <w:rPr>
-                <w:rFonts w:cs="Times New Roman"/>
-                <w:color w:val="000000" w:themeColor="text1"/>
-                <w:sz w:val="14"/>
-              </w:rPr>
-              <w:t>totals::</w:t>
-            </w:r>
-            <w:proofErr w:type="gramEnd"/>
-            <w:r>
-              <w:rPr>
-                <w:rFonts w:cs="Times New Roman"/>
-                <w:color w:val="000000" w:themeColor="text1"/>
-                <w:sz w:val="14"/>
-              </w:rPr>
-              <w:t>airline_code AS airline_code, valid_airlines::airline_name AS airline_name, totals::total_flights AS total_flights;</w:t>
-            </w:r>
-            <w:r>
-              <w:rPr>
-                <w:rFonts w:cs="Times New Roman"/>
-                <w:color w:val="000000" w:themeColor="text1"/>
-                <w:sz w:val="14"/>
-              </w:rPr>
-              <w:br/>
-              <w:t xml:space="preserve">ordered = ORDER result BY </w:t>
-            </w:r>
-            <w:proofErr w:type="spellStart"/>
-            <w:r>
-              <w:rPr>
-                <w:rFonts w:cs="Times New Roman"/>
-                <w:color w:val="000000" w:themeColor="text1"/>
-                <w:sz w:val="14"/>
-              </w:rPr>
-              <w:t>total_flights</w:t>
-            </w:r>
-            <w:proofErr w:type="spellEnd"/>
-            <w:r>
-              <w:rPr>
-                <w:rFonts w:cs="Times New Roman"/>
-                <w:color w:val="000000" w:themeColor="text1"/>
-                <w:sz w:val="14"/>
-              </w:rPr>
-              <w:t xml:space="preserve"> DESC;</w:t>
+              <w:t>result = FOREACH named GENERATE totals::airline_code AS airline_code, valid_airlines::airline_name AS airline_name, totals::total_flights AS total_flights;</w:t>
+            </w:r>
+            <w:r>
+              <w:rPr>
+                <w:rFonts w:cs="Times New Roman"/>
+                <w:color w:val="000000" w:themeColor="text1"/>
+                <w:sz w:val="14"/>
+              </w:rPr>
+              <w:br/>
+              <w:t>ordered = ORDER result BY total_flights DESC;</w:t>
             </w:r>
           </w:p>
           <w:p>
@@ -8934,35 +8630,7 @@
                 <w:sz w:val="14"/>
               </w:rPr>
               <w:br/>
-              <w:t xml:space="preserve">STORE ordered INTO 'E:/BDAL/Report_1/Flight_Data_Analysis/outputs/pig/01_airline_flight_totals' USING </w:t>
-            </w:r>
-            <w:proofErr w:type="spellStart"/>
-            <w:proofErr w:type="gramStart"/>
-            <w:r>
-              <w:rPr>
-                <w:rFonts w:cs="Times New Roman"/>
-                <w:color w:val="000000" w:themeColor="text1"/>
-                <w:sz w:val="14"/>
-              </w:rPr>
-              <w:t>PigStorage</w:t>
-            </w:r>
-            <w:proofErr w:type="spellEnd"/>
-            <w:r>
-              <w:rPr>
-                <w:rFonts w:cs="Times New Roman"/>
-                <w:color w:val="000000" w:themeColor="text1"/>
-                <w:sz w:val="14"/>
-              </w:rPr>
-              <w:t>(</w:t>
-            </w:r>
-            <w:proofErr w:type="gramEnd"/>
-            <w:r>
-              <w:rPr>
-                <w:rFonts w:cs="Times New Roman"/>
-                <w:color w:val="000000" w:themeColor="text1"/>
-                <w:sz w:val="14"/>
-              </w:rPr>
-              <w:t>'|');</w:t>
+              <w:t>STORE ordered INTO 'E:/BDAL/Report_1/Flight_Data_Analysis/outputs/pig/01_airline_flight_totals' USING PigStorage('|');</w:t>
             </w:r>
           </w:p>
         </w:tc>
@@ -9046,25 +8714,7 @@
                 <w:color w:val="000000" w:themeColor="text1"/>
                 <w:sz w:val="16"/>
               </w:rPr>
-              <w:t xml:space="preserve">pig -x local -f </w:t>
-            </w:r>
-            <w:proofErr w:type="spellStart"/>
-            <w:r>
-              <w:rPr>
-                <w:rFonts w:cs="Times New Roman"/>
-                <w:color w:val="000000" w:themeColor="text1"/>
-                <w:sz w:val="16"/>
-              </w:rPr>
-              <w:t>PigAnalysis</w:t>
-            </w:r>
-            <w:proofErr w:type="spellEnd"/>
-            <w:r>
-              <w:rPr>
-                <w:rFonts w:cs="Times New Roman"/>
-                <w:color w:val="000000" w:themeColor="text1"/>
-                <w:sz w:val="16"/>
-              </w:rPr>
-              <w:t>\scripts\01_airline</w:t>
+              <w:t>pig -x local -f PigAnalysis\scripts\01_airline</w:t>
             </w:r>
             <w:r>
               <w:rPr>
@@ -9354,43 +9004,23 @@
                 <w:color w:val="000000" w:themeColor="text1"/>
                 <w:sz w:val="14"/>
               </w:rPr>
-              <w:t>flights = LOAD 'E:/BDAL/</w:t>
-            </w:r>
-            <w:proofErr w:type="spellStart"/>
-            <w:r>
-              <w:rPr>
-                <w:rFonts w:cs="Times New Roman"/>
-                <w:color w:val="000000" w:themeColor="text1"/>
-                <w:sz w:val="14"/>
-              </w:rPr>
-              <w:t>New_Dataset</w:t>
-            </w:r>
-            <w:proofErr w:type="spellEnd"/>
-            <w:r>
-              <w:rPr>
-                <w:rFonts w:cs="Times New Roman"/>
-                <w:color w:val="000000" w:themeColor="text1"/>
-                <w:sz w:val="14"/>
-              </w:rPr>
-              <w:t xml:space="preserve">/flights.csv' USING </w:t>
-            </w:r>
-            <w:proofErr w:type="spellStart"/>
-            <w:r>
-              <w:rPr>
-                <w:rFonts w:cs="Times New Roman"/>
-                <w:color w:val="000000" w:themeColor="text1"/>
-                <w:sz w:val="14"/>
-              </w:rPr>
-              <w:t>PigStorage</w:t>
-            </w:r>
-            <w:proofErr w:type="spellEnd"/>
-            <w:r>
-              <w:rPr>
-                <w:rFonts w:cs="Times New Roman"/>
-                <w:color w:val="000000" w:themeColor="text1"/>
-                <w:sz w:val="14"/>
-              </w:rPr>
-              <w:t>(',') AS (year:int,month:int,day:int,day_of_week:int,airline:chararray,flight_number:int,tail_number:chararray,origin:chararray,destination:chararray,scheduled_departure:chararray,departure_time:chararray,departure_delay:double,taxi_out:double,wheels_off:chararray,scheduled_time:double,elapsed_time:double,air_time:double,distance:double,wheels_on:chararray,taxi_in:double,scheduled_arrival:chararray,arrival_time:chararray,arrival_delay:double,diverted:int,cancelled:int,cancellation_reason:chararray,air_system_delay:double,security_delay:double,airline_delay:double,late_aircraft_delay:double,weather_delay:double);</w:t>
+              <w:t>flights = LOAD '</w:t>
+            </w:r>
+            <w:r>
+              <w:rPr>
+                <w:rFonts w:cs="Times New Roman"/>
+                <w:color w:val="000000" w:themeColor="text1"/>
+                <w:sz w:val="14"/>
+              </w:rPr>
+              <w:t>E:\BDAL\Final_Assignment\Flight_Data_Analysis\data\flights.csv</w:t>
+            </w:r>
+            <w:r>
+              <w:rPr>
+                <w:rFonts w:cs="Times New Roman"/>
+                <w:color w:val="000000" w:themeColor="text1"/>
+                <w:sz w:val="14"/>
+              </w:rPr>
+              <w:t>' USING PigStorage(',') AS (year:int,month:int,day:int,day_of_week:int,airline:chararray,flight_number:int,tail_number:chararray,origin:chararray,destination:chararray,scheduled_departure:chararray,departure_time:chararray,departure_delay:double,taxi_out:double,wheels_off:chararray,scheduled_time:double,elapsed_time:double,air_time:double,distance:double,wheels_on:chararray,taxi_in:double,scheduled_arrival:chararray,arrival_time:chararray,arrival_delay:double,diverted:int,cancelled:int,cancellation_reason:chararray,air_system_delay:double,security_delay:double,airline_delay:double,late_aircraft_delay:double,weather_delay:double);</w:t>
             </w:r>
           </w:p>
           <w:p>
@@ -9426,25 +9056,7 @@
                 <w:sz w:val="14"/>
               </w:rPr>
               <w:br/>
-              <w:t xml:space="preserve">result = FOREACH grouped GENERATE group AS month, </w:t>
-            </w:r>
-            <w:proofErr w:type="gramStart"/>
-            <w:r>
-              <w:rPr>
-                <w:rFonts w:cs="Times New Roman"/>
-                <w:color w:val="000000" w:themeColor="text1"/>
-                <w:sz w:val="14"/>
-              </w:rPr>
-              <w:t>COUNT(</w:t>
-            </w:r>
-            <w:proofErr w:type="gramEnd"/>
-            <w:r>
-              <w:rPr>
-                <w:rFonts w:cs="Times New Roman"/>
-                <w:color w:val="000000" w:themeColor="text1"/>
-                <w:sz w:val="14"/>
-              </w:rPr>
-              <w:t>valid) AS total_flights;</w:t>
+              <w:t>result = FOREACH grouped GENERATE group AS month, COUNT(valid) AS total_flights;</w:t>
             </w:r>
             <w:r>
               <w:rPr>
@@ -9470,35 +9082,7 @@
                 <w:sz w:val="14"/>
               </w:rPr>
               <w:br/>
-              <w:t xml:space="preserve">STORE ordered INTO 'E:/BDAL/Report_1/Flight_Data_Analysis/outputs/pig/02_monthly_flight_totals' USING </w:t>
-            </w:r>
-            <w:proofErr w:type="spellStart"/>
-            <w:proofErr w:type="gramStart"/>
-            <w:r>
-              <w:rPr>
-                <w:rFonts w:cs="Times New Roman"/>
-                <w:color w:val="000000" w:themeColor="text1"/>
-                <w:sz w:val="14"/>
-              </w:rPr>
-              <w:t>PigStorage</w:t>
-            </w:r>
-            <w:proofErr w:type="spellEnd"/>
-            <w:r>
-              <w:rPr>
-                <w:rFonts w:cs="Times New Roman"/>
-                <w:color w:val="000000" w:themeColor="text1"/>
-                <w:sz w:val="14"/>
-              </w:rPr>
-              <w:t>(</w:t>
-            </w:r>
-            <w:proofErr w:type="gramEnd"/>
-            <w:r>
-              <w:rPr>
-                <w:rFonts w:cs="Times New Roman"/>
-                <w:color w:val="000000" w:themeColor="text1"/>
-                <w:sz w:val="14"/>
-              </w:rPr>
-              <w:t>'|');</w:t>
+              <w:t>STORE ordered INTO 'E:/BDAL/Report_1/Flight_Data_Analysis/outputs/pig/02_monthly_flight_totals' USING PigStorage('|');</w:t>
             </w:r>
           </w:p>
         </w:tc>
@@ -9865,43 +9449,23 @@
                 <w:color w:val="000000" w:themeColor="text1"/>
                 <w:sz w:val="14"/>
               </w:rPr>
-              <w:t>flights = LOAD 'E:/BDAL/</w:t>
-            </w:r>
-            <w:proofErr w:type="spellStart"/>
-            <w:r>
-              <w:rPr>
-                <w:rFonts w:cs="Times New Roman"/>
-                <w:color w:val="000000" w:themeColor="text1"/>
-                <w:sz w:val="14"/>
-              </w:rPr>
-              <w:t>New_Dataset</w:t>
-            </w:r>
-            <w:proofErr w:type="spellEnd"/>
-            <w:r>
-              <w:rPr>
-                <w:rFonts w:cs="Times New Roman"/>
-                <w:color w:val="000000" w:themeColor="text1"/>
-                <w:sz w:val="14"/>
-              </w:rPr>
-              <w:t xml:space="preserve">/flights.csv' USING </w:t>
-            </w:r>
-            <w:proofErr w:type="spellStart"/>
-            <w:r>
-              <w:rPr>
-                <w:rFonts w:cs="Times New Roman"/>
-                <w:color w:val="000000" w:themeColor="text1"/>
-                <w:sz w:val="14"/>
-              </w:rPr>
-              <w:t>PigStorage</w:t>
-            </w:r>
-            <w:proofErr w:type="spellEnd"/>
-            <w:r>
-              <w:rPr>
-                <w:rFonts w:cs="Times New Roman"/>
-                <w:color w:val="000000" w:themeColor="text1"/>
-                <w:sz w:val="14"/>
-              </w:rPr>
-              <w:t>(',') AS (year:int,month:int,day:int,day_of_week:int,airline:chararray,flight_number:int,tail_number:chararray,origin:chararray,destination:chararray,scheduled_departure:chararray,departure_time:chararray,departure_delay:double,taxi_out:double,wheels_off:chararray,scheduled_time:double,elapsed_time:double,air_time:double,distance:double,wheels_on:chararray,taxi_in:double,scheduled_arrival:chararray,arrival_time:chararray,arrival_delay:double,diverted:int,cancelled:int,cancellation_reason:chararray,air_system_delay:double,security_delay:double,airline_delay:double,late_aircraft_delay:double,weather_delay:double);</w:t>
+              <w:t>flights = LOAD '</w:t>
+            </w:r>
+            <w:r>
+              <w:rPr>
+                <w:rFonts w:cs="Times New Roman"/>
+                <w:color w:val="000000" w:themeColor="text1"/>
+                <w:sz w:val="14"/>
+              </w:rPr>
+              <w:t>E:\BDAL\Final_Assignment\Flight_Data_Analysis\data\flights.csv</w:t>
+            </w:r>
+            <w:r>
+              <w:rPr>
+                <w:rFonts w:cs="Times New Roman"/>
+                <w:color w:val="000000" w:themeColor="text1"/>
+                <w:sz w:val="14"/>
+              </w:rPr>
+              <w:t>' USING PigStorage(',') AS (year:int,month:int,day:int,day_of_week:int,airline:chararray,flight_number:int,tail_number:chararray,origin:chararray,destination:chararray,scheduled_departure:chararray,departure_time:chararray,departure_delay:double,taxi_out:double,wheels_off:chararray,scheduled_time:double,elapsed_time:double,air_time:double,distance:double,wheels_on:chararray,taxi_in:double,scheduled_arrival:chararray,arrival_time:chararray,arrival_delay:double,diverted:int,cancelled:int,cancellation_reason:chararray,air_system_delay:double,security_delay:double,airline_delay:double,late_aircraft_delay:double,weather_delay:double);</w:t>
             </w:r>
           </w:p>
           <w:p>
@@ -9937,25 +9501,7 @@
                 <w:sz w:val="14"/>
               </w:rPr>
               <w:br/>
-              <w:t xml:space="preserve">counts = FOREACH grouped GENERATE group AS origin_airport, </w:t>
-            </w:r>
-            <w:proofErr w:type="gramStart"/>
-            <w:r>
-              <w:rPr>
-                <w:rFonts w:cs="Times New Roman"/>
-                <w:color w:val="000000" w:themeColor="text1"/>
-                <w:sz w:val="14"/>
-              </w:rPr>
-              <w:t>COUNT(</w:t>
-            </w:r>
-            <w:proofErr w:type="gramEnd"/>
-            <w:r>
-              <w:rPr>
-                <w:rFonts w:cs="Times New Roman"/>
-                <w:color w:val="000000" w:themeColor="text1"/>
-                <w:sz w:val="14"/>
-              </w:rPr>
-              <w:t>valid) AS departures;</w:t>
+              <w:t>counts = FOREACH grouped GENERATE group AS origin_airport, COUNT(valid) AS departures;</w:t>
             </w:r>
             <w:r>
               <w:rPr>
@@ -9990,35 +9536,7 @@
                 <w:sz w:val="14"/>
               </w:rPr>
               <w:br/>
-              <w:t xml:space="preserve">STORE result INTO 'E:/BDAL/Report_1/Flight_Data_Analysis/outputs/pig/03_top_origin_airports' USING </w:t>
-            </w:r>
-            <w:proofErr w:type="spellStart"/>
-            <w:proofErr w:type="gramStart"/>
-            <w:r>
-              <w:rPr>
-                <w:rFonts w:cs="Times New Roman"/>
-                <w:color w:val="000000" w:themeColor="text1"/>
-                <w:sz w:val="14"/>
-              </w:rPr>
-              <w:t>PigStorage</w:t>
-            </w:r>
-            <w:proofErr w:type="spellEnd"/>
-            <w:r>
-              <w:rPr>
-                <w:rFonts w:cs="Times New Roman"/>
-                <w:color w:val="000000" w:themeColor="text1"/>
-                <w:sz w:val="14"/>
-              </w:rPr>
-              <w:t>(</w:t>
-            </w:r>
-            <w:proofErr w:type="gramEnd"/>
-            <w:r>
-              <w:rPr>
-                <w:rFonts w:cs="Times New Roman"/>
-                <w:color w:val="000000" w:themeColor="text1"/>
-                <w:sz w:val="14"/>
-              </w:rPr>
-              <w:t>'|');</w:t>
+              <w:t>STORE result INTO 'E:/BDAL/Report_1/Flight_Data_Analysis/outputs/pig/03_top_origin_airports' USING PigStorage('|');</w:t>
             </w:r>
           </w:p>
         </w:tc>
@@ -10375,43 +9893,23 @@
                 <w:color w:val="000000" w:themeColor="text1"/>
                 <w:sz w:val="14"/>
               </w:rPr>
-              <w:t>flights = LOAD 'E:/BDAL/</w:t>
-            </w:r>
-            <w:proofErr w:type="spellStart"/>
-            <w:r>
-              <w:rPr>
-                <w:rFonts w:cs="Times New Roman"/>
-                <w:color w:val="000000" w:themeColor="text1"/>
-                <w:sz w:val="14"/>
-              </w:rPr>
-              <w:t>New_Dataset</w:t>
-            </w:r>
-            <w:proofErr w:type="spellEnd"/>
-            <w:r>
-              <w:rPr>
-                <w:rFonts w:cs="Times New Roman"/>
-                <w:color w:val="000000" w:themeColor="text1"/>
-                <w:sz w:val="14"/>
-              </w:rPr>
-              <w:t xml:space="preserve">/flights.csv' USING </w:t>
-            </w:r>
-            <w:proofErr w:type="spellStart"/>
-            <w:r>
-              <w:rPr>
-                <w:rFonts w:cs="Times New Roman"/>
-                <w:color w:val="000000" w:themeColor="text1"/>
-                <w:sz w:val="14"/>
-              </w:rPr>
-              <w:t>PigStorage</w:t>
-            </w:r>
-            <w:proofErr w:type="spellEnd"/>
-            <w:r>
-              <w:rPr>
-                <w:rFonts w:cs="Times New Roman"/>
-                <w:color w:val="000000" w:themeColor="text1"/>
-                <w:sz w:val="14"/>
-              </w:rPr>
-              <w:t>(',') AS (year:int,month:int,day:int,day_of_week:int,airline:chararray,flight_number:int,tail_number:chararray,origin:chararray,destination:chararray,scheduled_departure:chararray,departure_time:chararray,departure_delay:double,taxi_out:double,wheels_off:chararray,scheduled_time:double,elapsed_time:double,air_time:double,distance:double,wheels_on:chararray,taxi_in:double,scheduled_arrival:chararray,arrival_time:chararray,arrival_delay:double,diverted:int,cancelled:int,cancellation_reason:chararray,air_system_delay:double,security_delay:double,airline_delay:double,late_aircraft_delay:double,weather_delay:double);</w:t>
+              <w:t>flights = LOAD '</w:t>
+            </w:r>
+            <w:r>
+              <w:rPr>
+                <w:rFonts w:cs="Times New Roman"/>
+                <w:color w:val="000000" w:themeColor="text1"/>
+                <w:sz w:val="14"/>
+              </w:rPr>
+              <w:t>E:\BDAL\Final_Assignment\Flight_Data_Analysis\data\flights.csv</w:t>
+            </w:r>
+            <w:r>
+              <w:rPr>
+                <w:rFonts w:cs="Times New Roman"/>
+                <w:color w:val="000000" w:themeColor="text1"/>
+                <w:sz w:val="14"/>
+              </w:rPr>
+              <w:t>' USING PigStorage(',') AS (year:int,month:int,day:int,day_of_week:int,airline:chararray,flight_number:int,tail_number:chararray,origin:chararray,destination:chararray,scheduled_departure:chararray,departure_time:chararray,departure_delay:double,taxi_out:double,wheels_off:chararray,scheduled_time:double,elapsed_time:double,air_time:double,distance:double,wheels_on:chararray,taxi_in:double,scheduled_arrival:chararray,arrival_time:chararray,arrival_delay:double,diverted:int,cancelled:int,cancellation_reason:chararray,air_system_delay:double,security_delay:double,airline_delay:double,late_aircraft_delay:double,weather_delay:double);</w:t>
             </w:r>
           </w:p>
           <w:p>
@@ -10447,52 +9945,16 @@
                 <w:sz w:val="14"/>
               </w:rPr>
               <w:br/>
-              <w:t xml:space="preserve">counts = FOREACH grouped GENERATE </w:t>
-            </w:r>
-            <w:proofErr w:type="gramStart"/>
-            <w:r>
-              <w:rPr>
-                <w:rFonts w:cs="Times New Roman"/>
-                <w:color w:val="000000" w:themeColor="text1"/>
-                <w:sz w:val="14"/>
-              </w:rPr>
-              <w:t>FLATTEN(</w:t>
-            </w:r>
-            <w:proofErr w:type="gramEnd"/>
-            <w:r>
-              <w:rPr>
-                <w:rFonts w:cs="Times New Roman"/>
-                <w:color w:val="000000" w:themeColor="text1"/>
-                <w:sz w:val="14"/>
-              </w:rPr>
-              <w:t>group) AS (origin_airport, destination_airport), COUNT(valid) AS total_flights;</w:t>
-            </w:r>
-            <w:r>
-              <w:rPr>
-                <w:rFonts w:cs="Times New Roman"/>
-                <w:color w:val="000000" w:themeColor="text1"/>
-                <w:sz w:val="14"/>
-              </w:rPr>
-              <w:br/>
-              <w:t xml:space="preserve">ordered = ORDER counts BY </w:t>
-            </w:r>
-            <w:proofErr w:type="spellStart"/>
-            <w:r>
-              <w:rPr>
-                <w:rFonts w:cs="Times New Roman"/>
-                <w:color w:val="000000" w:themeColor="text1"/>
-                <w:sz w:val="14"/>
-              </w:rPr>
-              <w:t>total_flights</w:t>
-            </w:r>
-            <w:proofErr w:type="spellEnd"/>
-            <w:r>
-              <w:rPr>
-                <w:rFonts w:cs="Times New Roman"/>
-                <w:color w:val="000000" w:themeColor="text1"/>
-                <w:sz w:val="14"/>
-              </w:rPr>
-              <w:t xml:space="preserve"> DESC;</w:t>
+              <w:t>counts = FOREACH grouped GENERATE FLATTEN(group) AS (origin_airport, destination_airport), COUNT(valid) AS total_flights;</w:t>
+            </w:r>
+            <w:r>
+              <w:rPr>
+                <w:rFonts w:cs="Times New Roman"/>
+                <w:color w:val="000000" w:themeColor="text1"/>
+                <w:sz w:val="14"/>
+              </w:rPr>
+              <w:br/>
+              <w:t>ordered = ORDER counts BY total_flights DESC;</w:t>
             </w:r>
           </w:p>
           <w:p>
@@ -10518,35 +9980,7 @@
                 <w:sz w:val="14"/>
               </w:rPr>
               <w:br/>
-              <w:t xml:space="preserve">STORE result INTO 'E:/BDAL/Report_1/Flight_Data_Analysis/outputs/pig/04_top_routes' USING </w:t>
-            </w:r>
-            <w:proofErr w:type="spellStart"/>
-            <w:proofErr w:type="gramStart"/>
-            <w:r>
-              <w:rPr>
-                <w:rFonts w:cs="Times New Roman"/>
-                <w:color w:val="000000" w:themeColor="text1"/>
-                <w:sz w:val="14"/>
-              </w:rPr>
-              <w:t>PigStorage</w:t>
-            </w:r>
-            <w:proofErr w:type="spellEnd"/>
-            <w:r>
-              <w:rPr>
-                <w:rFonts w:cs="Times New Roman"/>
-                <w:color w:val="000000" w:themeColor="text1"/>
-                <w:sz w:val="14"/>
-              </w:rPr>
-              <w:t>(</w:t>
-            </w:r>
-            <w:proofErr w:type="gramEnd"/>
-            <w:r>
-              <w:rPr>
-                <w:rFonts w:cs="Times New Roman"/>
-                <w:color w:val="000000" w:themeColor="text1"/>
-                <w:sz w:val="14"/>
-              </w:rPr>
-              <w:t>'|');</w:t>
+              <w:t>STORE result INTO 'E:/BDAL/Report_1/Flight_Data_Analysis/outputs/pig/04_top_routes' USING PigStorage('|');</w:t>
             </w:r>
           </w:p>
         </w:tc>
@@ -10904,43 +10338,23 @@
                 <w:color w:val="000000" w:themeColor="text1"/>
                 <w:sz w:val="14"/>
               </w:rPr>
-              <w:t>flights = LOAD 'E:/BDAL/</w:t>
-            </w:r>
-            <w:proofErr w:type="spellStart"/>
-            <w:r>
-              <w:rPr>
-                <w:rFonts w:cs="Times New Roman"/>
-                <w:color w:val="000000" w:themeColor="text1"/>
-                <w:sz w:val="14"/>
-              </w:rPr>
-              <w:t>New_Dataset</w:t>
-            </w:r>
-            <w:proofErr w:type="spellEnd"/>
-            <w:r>
-              <w:rPr>
-                <w:rFonts w:cs="Times New Roman"/>
-                <w:color w:val="000000" w:themeColor="text1"/>
-                <w:sz w:val="14"/>
-              </w:rPr>
-              <w:t xml:space="preserve">/flights.csv' USING </w:t>
-            </w:r>
-            <w:proofErr w:type="spellStart"/>
-            <w:r>
-              <w:rPr>
-                <w:rFonts w:cs="Times New Roman"/>
-                <w:color w:val="000000" w:themeColor="text1"/>
-                <w:sz w:val="14"/>
-              </w:rPr>
-              <w:t>PigStorage</w:t>
-            </w:r>
-            <w:proofErr w:type="spellEnd"/>
-            <w:r>
-              <w:rPr>
-                <w:rFonts w:cs="Times New Roman"/>
-                <w:color w:val="000000" w:themeColor="text1"/>
-                <w:sz w:val="14"/>
-              </w:rPr>
-              <w:t>(',') AS (year:int,month:int,day:int,day_of_week:int,airline:chararray,flight_number:int,tail_number:chararray,origin:chararray,destination:chararray,scheduled_departure:chararray,departure_time:chararray,departure_delay:double,taxi_out:double,wheels_off:chararray,scheduled_time:double,elapsed_time:double,air_time:double,distance:double,wheels_on:chararray,taxi_in:double,scheduled_arrival:chararray,arrival_time:chararray,arrival_delay:double,diverted:int,cancelled:int,cancellation_reason:chararray,air_system_delay:double,security_delay:double,airline_delay:double,late_aircraft_delay:double,weather_delay:double);</w:t>
+              <w:t>flights = LOAD '</w:t>
+            </w:r>
+            <w:r>
+              <w:rPr>
+                <w:rFonts w:cs="Times New Roman"/>
+                <w:color w:val="000000" w:themeColor="text1"/>
+                <w:sz w:val="14"/>
+              </w:rPr>
+              <w:t>E:\BDAL\Final_Assignment\Flight_Data_Analysis\data\flights.csv</w:t>
+            </w:r>
+            <w:r>
+              <w:rPr>
+                <w:rFonts w:cs="Times New Roman"/>
+                <w:color w:val="000000" w:themeColor="text1"/>
+                <w:sz w:val="14"/>
+              </w:rPr>
+              <w:t>' USING PigStorage(',') AS (year:int,month:int,day:int,day_of_week:int,airline:chararray,flight_number:int,tail_number:chararray,origin:chararray,destination:chararray,scheduled_departure:chararray,departure_time:chararray,departure_delay:double,taxi_out:double,wheels_off:chararray,scheduled_time:double,elapsed_time:double,air_time:double,distance:double,wheels_on:chararray,taxi_in:double,scheduled_arrival:chararray,arrival_time:chararray,arrival_delay:double,diverted:int,cancelled:int,cancellation_reason:chararray,air_system_delay:double,security_delay:double,airline_delay:double,late_aircraft_delay:double,weather_delay:double);</w:t>
             </w:r>
           </w:p>
           <w:p>
@@ -10976,52 +10390,16 @@
                 <w:sz w:val="14"/>
               </w:rPr>
               <w:br/>
-              <w:t xml:space="preserve">result = FOREACH grouped GENERATE group AS airline_code, </w:t>
-            </w:r>
-            <w:proofErr w:type="gramStart"/>
-            <w:r>
-              <w:rPr>
-                <w:rFonts w:cs="Times New Roman"/>
-                <w:color w:val="000000" w:themeColor="text1"/>
-                <w:sz w:val="14"/>
-              </w:rPr>
-              <w:t>AVG(</w:t>
-            </w:r>
-            <w:proofErr w:type="gramEnd"/>
-            <w:r>
-              <w:rPr>
-                <w:rFonts w:cs="Times New Roman"/>
-                <w:color w:val="000000" w:themeColor="text1"/>
-                <w:sz w:val="14"/>
-              </w:rPr>
-              <w:t>valid.departure_delay) AS average_departure_delay_minutes;</w:t>
-            </w:r>
-            <w:r>
-              <w:rPr>
-                <w:rFonts w:cs="Times New Roman"/>
-                <w:color w:val="000000" w:themeColor="text1"/>
-                <w:sz w:val="14"/>
-              </w:rPr>
-              <w:br/>
-              <w:t xml:space="preserve">ordered = ORDER result BY </w:t>
-            </w:r>
-            <w:proofErr w:type="spellStart"/>
-            <w:r>
-              <w:rPr>
-                <w:rFonts w:cs="Times New Roman"/>
-                <w:color w:val="000000" w:themeColor="text1"/>
-                <w:sz w:val="14"/>
-              </w:rPr>
-              <w:t>average_departure_delay_minutes</w:t>
-            </w:r>
-            <w:proofErr w:type="spellEnd"/>
-            <w:r>
-              <w:rPr>
-                <w:rFonts w:cs="Times New Roman"/>
-                <w:color w:val="000000" w:themeColor="text1"/>
-                <w:sz w:val="14"/>
-              </w:rPr>
-              <w:t xml:space="preserve"> DESC;</w:t>
+              <w:t>result = FOREACH grouped GENERATE group AS airline_code, AVG(valid.departure_delay) AS average_departure_delay_minutes;</w:t>
+            </w:r>
+            <w:r>
+              <w:rPr>
+                <w:rFonts w:cs="Times New Roman"/>
+                <w:color w:val="000000" w:themeColor="text1"/>
+                <w:sz w:val="14"/>
+              </w:rPr>
+              <w:br/>
+              <w:t>ordered = ORDER result BY average_departure_delay_minutes DESC;</w:t>
             </w:r>
           </w:p>
           <w:p>
@@ -11038,35 +10416,7 @@
                 <w:sz w:val="14"/>
               </w:rPr>
               <w:br/>
-              <w:t xml:space="preserve">STORE ordered INTO 'E:/BDAL/Report_1/Flight_Data_Analysis/outputs/pig/05_average_departure_delay_by_airline' USING </w:t>
-            </w:r>
-            <w:proofErr w:type="spellStart"/>
-            <w:proofErr w:type="gramStart"/>
-            <w:r>
-              <w:rPr>
-                <w:rFonts w:cs="Times New Roman"/>
-                <w:color w:val="000000" w:themeColor="text1"/>
-                <w:sz w:val="14"/>
-              </w:rPr>
-              <w:t>PigStorage</w:t>
-            </w:r>
-            <w:proofErr w:type="spellEnd"/>
-            <w:r>
-              <w:rPr>
-                <w:rFonts w:cs="Times New Roman"/>
-                <w:color w:val="000000" w:themeColor="text1"/>
-                <w:sz w:val="14"/>
-              </w:rPr>
-              <w:t>(</w:t>
-            </w:r>
-            <w:proofErr w:type="gramEnd"/>
-            <w:r>
-              <w:rPr>
-                <w:rFonts w:cs="Times New Roman"/>
-                <w:color w:val="000000" w:themeColor="text1"/>
-                <w:sz w:val="14"/>
-              </w:rPr>
-              <w:t>'|');</w:t>
+              <w:t>STORE ordered INTO 'E:/BDAL/Report_1/Flight_Data_Analysis/outputs/pig/05_average_departure_delay_by_airline' USING PigStorage('|');</w:t>
             </w:r>
           </w:p>
         </w:tc>
@@ -11415,43 +10765,23 @@
                 <w:color w:val="000000" w:themeColor="text1"/>
                 <w:sz w:val="14"/>
               </w:rPr>
-              <w:t>flights = LOAD 'E:/BDAL/</w:t>
-            </w:r>
-            <w:proofErr w:type="spellStart"/>
-            <w:r>
-              <w:rPr>
-                <w:rFonts w:cs="Times New Roman"/>
-                <w:color w:val="000000" w:themeColor="text1"/>
-                <w:sz w:val="14"/>
-              </w:rPr>
-              <w:t>New_Dataset</w:t>
-            </w:r>
-            <w:proofErr w:type="spellEnd"/>
-            <w:r>
-              <w:rPr>
-                <w:rFonts w:cs="Times New Roman"/>
-                <w:color w:val="000000" w:themeColor="text1"/>
-                <w:sz w:val="14"/>
-              </w:rPr>
-              <w:t xml:space="preserve">/flights.csv' USING </w:t>
-            </w:r>
-            <w:proofErr w:type="spellStart"/>
-            <w:r>
-              <w:rPr>
-                <w:rFonts w:cs="Times New Roman"/>
-                <w:color w:val="000000" w:themeColor="text1"/>
-                <w:sz w:val="14"/>
-              </w:rPr>
-              <w:t>PigStorage</w:t>
-            </w:r>
-            <w:proofErr w:type="spellEnd"/>
-            <w:r>
-              <w:rPr>
-                <w:rFonts w:cs="Times New Roman"/>
-                <w:color w:val="000000" w:themeColor="text1"/>
-                <w:sz w:val="14"/>
-              </w:rPr>
-              <w:t>(',') AS (year:int,month:int,day:int,day_of_week:int,airline:chararray,flight_number:int,tail_number:chararray,origin:chararray,destination:chararray,scheduled_departure:chararray,departure_time:chararray,departure_delay:double,taxi_out:double,wheels_off:chararray,scheduled_time:double,elapsed_time:double,air_time:double,distance:double,wheels_on:chararray,taxi_in:double,scheduled_arrival:chararray,arrival_time:chararray,arrival_delay:double,diverted:int,cancelled:int,cancellation_reason:chararray,air_system_delay:double,security_delay:double,airline_delay:double,late_aircraft_delay:double,weather_delay:double);</w:t>
+              <w:t>flights = LOAD '</w:t>
+            </w:r>
+            <w:r>
+              <w:rPr>
+                <w:rFonts w:cs="Times New Roman"/>
+                <w:color w:val="000000" w:themeColor="text1"/>
+                <w:sz w:val="14"/>
+              </w:rPr>
+              <w:t>E:\BDAL\Final_Assignment\Flight_Data_Analysis\data\flights.csv</w:t>
+            </w:r>
+            <w:r>
+              <w:rPr>
+                <w:rFonts w:cs="Times New Roman"/>
+                <w:color w:val="000000" w:themeColor="text1"/>
+                <w:sz w:val="14"/>
+              </w:rPr>
+              <w:t>' USING PigStorage(',') AS (year:int,month:int,day:int,day_of_week:int,airline:chararray,flight_number:int,tail_number:chararray,origin:chararray,destination:chararray,scheduled_departure:chararray,departure_time:chararray,departure_delay:double,taxi_out:double,wheels_off:chararray,scheduled_time:double,elapsed_time:double,air_time:double,distance:double,wheels_on:chararray,taxi_in:double,scheduled_arrival:chararray,arrival_time:chararray,arrival_delay:double,diverted:int,cancelled:int,cancellation_reason:chararray,air_system_delay:double,security_delay:double,airline_delay:double,late_aircraft_delay:double,weather_delay:double);</w:t>
             </w:r>
           </w:p>
           <w:p>
@@ -11487,52 +10817,16 @@
                 <w:sz w:val="14"/>
               </w:rPr>
               <w:br/>
-              <w:t xml:space="preserve">result = FOREACH grouped GENERATE group AS airline_code, </w:t>
-            </w:r>
-            <w:proofErr w:type="gramStart"/>
-            <w:r>
-              <w:rPr>
-                <w:rFonts w:cs="Times New Roman"/>
-                <w:color w:val="000000" w:themeColor="text1"/>
-                <w:sz w:val="14"/>
-              </w:rPr>
-              <w:t>COUNT(</w:t>
-            </w:r>
-            <w:proofErr w:type="gramEnd"/>
-            <w:r>
-              <w:rPr>
-                <w:rFonts w:cs="Times New Roman"/>
-                <w:color w:val="000000" w:themeColor="text1"/>
-                <w:sz w:val="14"/>
-              </w:rPr>
-              <w:t>cancelled_flights) AS cancelled_flights;</w:t>
-            </w:r>
-            <w:r>
-              <w:rPr>
-                <w:rFonts w:cs="Times New Roman"/>
-                <w:color w:val="000000" w:themeColor="text1"/>
-                <w:sz w:val="14"/>
-              </w:rPr>
-              <w:br/>
-              <w:t xml:space="preserve">ordered = ORDER result BY </w:t>
-            </w:r>
-            <w:proofErr w:type="spellStart"/>
-            <w:r>
-              <w:rPr>
-                <w:rFonts w:cs="Times New Roman"/>
-                <w:color w:val="000000" w:themeColor="text1"/>
-                <w:sz w:val="14"/>
-              </w:rPr>
-              <w:t>cancelled_flights</w:t>
-            </w:r>
-            <w:proofErr w:type="spellEnd"/>
-            <w:r>
-              <w:rPr>
-                <w:rFonts w:cs="Times New Roman"/>
-                <w:color w:val="000000" w:themeColor="text1"/>
-                <w:sz w:val="14"/>
-              </w:rPr>
-              <w:t xml:space="preserve"> DESC;</w:t>
+              <w:t>result = FOREACH grouped GENERATE group AS airline_code, COUNT(cancelled_flights) AS cancelled_flights;</w:t>
+            </w:r>
+            <w:r>
+              <w:rPr>
+                <w:rFonts w:cs="Times New Roman"/>
+                <w:color w:val="000000" w:themeColor="text1"/>
+                <w:sz w:val="14"/>
+              </w:rPr>
+              <w:br/>
+              <w:t>ordered = ORDER result BY cancelled_flights DESC;</w:t>
             </w:r>
           </w:p>
           <w:p>
@@ -11549,25 +10843,7 @@
                 <w:sz w:val="14"/>
               </w:rPr>
               <w:br/>
-              <w:t xml:space="preserve">STORE ordered INTO 'E:/BDAL/Report_1/Flight_Data_Analysis/outputs/pig/06_cancellations_by_airline' USING </w:t>
-            </w:r>
-            <w:proofErr w:type="gramStart"/>
-            <w:r>
-              <w:rPr>
-                <w:rFonts w:cs="Times New Roman"/>
-                <w:color w:val="000000" w:themeColor="text1"/>
-                <w:sz w:val="14"/>
-              </w:rPr>
-              <w:t>PigStorage(</w:t>
-            </w:r>
-            <w:proofErr w:type="gramEnd"/>
-            <w:r>
-              <w:rPr>
-                <w:rFonts w:cs="Times New Roman"/>
-                <w:color w:val="000000" w:themeColor="text1"/>
-                <w:sz w:val="14"/>
-              </w:rPr>
-              <w:t>'|');</w:t>
+              <w:t>STORE ordered INTO 'E:/BDAL/Report_1/Flight_Data_Analysis/outputs/pig/06_cancellations_by_airline' USING PigStorage('|');</w:t>
             </w:r>
           </w:p>
           <w:p>
@@ -11933,43 +11209,23 @@
                 <w:color w:val="000000" w:themeColor="text1"/>
                 <w:sz w:val="14"/>
               </w:rPr>
-              <w:t>flights = LOAD 'E:/BDAL/</w:t>
-            </w:r>
-            <w:proofErr w:type="spellStart"/>
-            <w:r>
-              <w:rPr>
-                <w:rFonts w:cs="Times New Roman"/>
-                <w:color w:val="000000" w:themeColor="text1"/>
-                <w:sz w:val="14"/>
-              </w:rPr>
-              <w:t>New_Dataset</w:t>
-            </w:r>
-            <w:proofErr w:type="spellEnd"/>
-            <w:r>
-              <w:rPr>
-                <w:rFonts w:cs="Times New Roman"/>
-                <w:color w:val="000000" w:themeColor="text1"/>
-                <w:sz w:val="14"/>
-              </w:rPr>
-              <w:t xml:space="preserve">/flights.csv' USING </w:t>
-            </w:r>
-            <w:proofErr w:type="spellStart"/>
-            <w:r>
-              <w:rPr>
-                <w:rFonts w:cs="Times New Roman"/>
-                <w:color w:val="000000" w:themeColor="text1"/>
-                <w:sz w:val="14"/>
-              </w:rPr>
-              <w:t>PigStorage</w:t>
-            </w:r>
-            <w:proofErr w:type="spellEnd"/>
-            <w:r>
-              <w:rPr>
-                <w:rFonts w:cs="Times New Roman"/>
-                <w:color w:val="000000" w:themeColor="text1"/>
-                <w:sz w:val="14"/>
-              </w:rPr>
-              <w:t>(',') AS (year:int,month:int,day:int,day_of_week:int,airline:chararray,flight_number:int,tail_number:chararray,origin:chararray,destination:chararray,scheduled_departure:chararray,departure_time:chararray,departure_delay:double,taxi_out:double,wheels_off:chararray,scheduled_time:double,elapsed_time:double,air_time:double,distance:double,wheels_on:chararray,taxi_in:double,scheduled_arrival:chararray,arrival_time:chararray,arrival_delay:double,diverted:int,cancelled:int,cancellation_reason:chararray,air_system_delay:double,security_delay:double,airline_delay:double,late_aircraft_delay:double,weather_delay:double);</w:t>
+              <w:t>flights = LOAD '</w:t>
+            </w:r>
+            <w:r>
+              <w:rPr>
+                <w:rFonts w:cs="Times New Roman"/>
+                <w:color w:val="000000" w:themeColor="text1"/>
+                <w:sz w:val="14"/>
+              </w:rPr>
+              <w:t>E:\BDAL\Final_Assignment\Flight_Data_Analysis\data\flights.csv</w:t>
+            </w:r>
+            <w:r>
+              <w:rPr>
+                <w:rFonts w:cs="Times New Roman"/>
+                <w:color w:val="000000" w:themeColor="text1"/>
+                <w:sz w:val="14"/>
+              </w:rPr>
+              <w:t>' USING PigStorage(',') AS (year:int,month:int,day:int,day_of_week:int,airline:chararray,flight_number:int,tail_number:chararray,origin:chararray,destination:chararray,scheduled_departure:chararray,departure_time:chararray,departure_delay:double,taxi_out:double,wheels_off:chararray,scheduled_time:double,elapsed_time:double,air_time:double,distance:double,wheels_on:chararray,taxi_in:double,scheduled_arrival:chararray,arrival_time:chararray,arrival_delay:double,diverted:int,cancelled:int,cancellation_reason:chararray,air_system_delay:double,security_delay:double,airline_delay:double,late_aircraft_delay:double,weather_delay:double);</w:t>
             </w:r>
           </w:p>
           <w:p>
@@ -12005,25 +11261,7 @@
                 <w:sz w:val="14"/>
               </w:rPr>
               <w:br/>
-              <w:t xml:space="preserve">result = FOREACH grouped GENERATE group AS month, </w:t>
-            </w:r>
-            <w:proofErr w:type="gramStart"/>
-            <w:r>
-              <w:rPr>
-                <w:rFonts w:cs="Times New Roman"/>
-                <w:color w:val="000000" w:themeColor="text1"/>
-                <w:sz w:val="14"/>
-              </w:rPr>
-              <w:t>AVG(</w:t>
-            </w:r>
-            <w:proofErr w:type="gramEnd"/>
-            <w:r>
-              <w:rPr>
-                <w:rFonts w:cs="Times New Roman"/>
-                <w:color w:val="000000" w:themeColor="text1"/>
-                <w:sz w:val="14"/>
-              </w:rPr>
-              <w:t>valid.arrival_delay) AS average_arrival_delay_minutes;</w:t>
+              <w:t>result = FOREACH grouped GENERATE group AS month, AVG(valid.arrival_delay) AS average_arrival_delay_minutes;</w:t>
             </w:r>
             <w:r>
               <w:rPr>
@@ -12049,35 +11287,7 @@
                 <w:sz w:val="14"/>
               </w:rPr>
               <w:br/>
-              <w:t xml:space="preserve">STORE ordered INTO 'E:/BDAL/Report_1/Flight_Data_Analysis/outputs/pig/07_average_arrival_delay_by_month' USING </w:t>
-            </w:r>
-            <w:proofErr w:type="spellStart"/>
-            <w:proofErr w:type="gramStart"/>
-            <w:r>
-              <w:rPr>
-                <w:rFonts w:cs="Times New Roman"/>
-                <w:color w:val="000000" w:themeColor="text1"/>
-                <w:sz w:val="14"/>
-              </w:rPr>
-              <w:t>PigStorage</w:t>
-            </w:r>
-            <w:proofErr w:type="spellEnd"/>
-            <w:r>
-              <w:rPr>
-                <w:rFonts w:cs="Times New Roman"/>
-                <w:color w:val="000000" w:themeColor="text1"/>
-                <w:sz w:val="14"/>
-              </w:rPr>
-              <w:t>(</w:t>
-            </w:r>
-            <w:proofErr w:type="gramEnd"/>
-            <w:r>
-              <w:rPr>
-                <w:rFonts w:cs="Times New Roman"/>
-                <w:color w:val="000000" w:themeColor="text1"/>
-                <w:sz w:val="14"/>
-              </w:rPr>
-              <w:t>'|');</w:t>
+              <w:t>STORE ordered INTO 'E:/BDAL/Report_1/Flight_Data_Analysis/outputs/pig/07_average_arrival_delay_by_month' USING PigStorage('|');</w:t>
             </w:r>
           </w:p>
         </w:tc>

</xml_diff>